<commit_message>
deck+guide: enrich April operations slide with Q1 narrative (Quarts bottleneck, supplier concentration, QA baseline); plain-text operator notes; template spec
</commit_message>
<xml_diff>
--- a/board-template/2026-04/U1Dynamics_GM_Presenter_Guide_2026_04.docx
+++ b/board-template/2026-04/U1Dynamics_GM_Presenter_Guide_2026_04.docx
@@ -1940,7 +1940,7 @@
           <w:sz w:val="30"/>
           <w:szCs w:val="30"/>
         </w:rPr>
-        <w:t xml:space="preserve">The plant is not the bottleneck; inventory visibility is the open item</w:t>
+        <w:t xml:space="preserve">Capacity is adequate overall; the Quarts line is the real constraint</w:t>
       </w:r>
     </w:p>
     <w:tbl>
@@ -2042,7 +2042,7 @@
                 <w:sz w:val="19"/>
                 <w:szCs w:val="19"/>
               </w:rPr>
-              <w:t xml:space="preserve">Add inventory anchor</w:t>
+              <w:t xml:space="preserve">Approve measurement + Quarts evaluation</w:t>
             </w:r>
           </w:p>
         </w:tc>
@@ -2077,7 +2077,7 @@
           <w:sz w:val="21"/>
           <w:szCs w:val="21"/>
         </w:rPr>
-        <w:t xml:space="preserve">Operationally, April was clean. We produced 134,620 gallons across 22 workdays and billed 103,453 — so production ran ahead of billing and we built roughly 31,000 gallons of inventory. Zero quality, supply, or line-down incidents. The board shouldn't spend much time on plant execution. The one open item is inventory visibility — opening and closing inventory, days of cover, and the dollar value of that movement. I've asked Ops and Finance to add that anchor before the next distribution.</w:t>
+        <w:t xml:space="preserve">Operationally, Q1 output rose 28% year over year — 374,866 gallons, averaging 127,372 a month and peaking at 141,506 in March; annualized, about 1.5 million gallons a year. The plant has slack in aggregate, but the Quarts line is at its real ceiling — roughly 1,208 gallons a day at 96.5% availability — so it is our primary bottleneck for quart-format demand; the batch lines are efficient when they run. Two gaps I want you to hear from me first: we depend on a single active oil supplier, Lubrimar, plus packaging vendors with lead-time and quality exposure; and at the start of this tenure there were no formal QA records, no finished-goods retains, and no OSHA log — one minor PPE incident. We are standing up measurement and QA now, and we have already secured an alternative drum supplier for Q2.</w:t>
       </w:r>
     </w:p>
     <w:p>
@@ -2104,7 +2104,7 @@
           <w:sz w:val="21"/>
           <w:szCs w:val="21"/>
         </w:rPr>
-        <w:t xml:space="preserve">En lo operativo, abril fue limpio. Produjimos 134,620 galones en 22 días hábiles y facturamos 103,453 — la producción superó la facturación y acumulamos unos 31,000 galones de inventario. Cero incidentes de calidad, suministro o paro de línea. El Consejo no debería dedicar mucho tiempo a la ejecución de planta. El único punto abierto es la visibilidad de inventario — inventario inicial y final, días de cobertura y el valor en dólares de ese movimiento. Pedí a Operaciones y Finanzas agregar ese anclaje antes de la próxima distribución.</w:t>
+        <w:t xml:space="preserve">En lo operativo, la producción del primer trimestre subió 28% interanual — 374,866 galones, promedio de 127,372 al mes y pico de 141,506 en marzo; anualizado, cerca de 1.5 millones de galones al año. La planta tiene holgura en agregado, pero la línea de Quarts está en su techo real — unos 1,208 galones por día al 96.5% de disponibilidad — es nuestro cuello de botella primario para el formato quart; las líneas batch son eficientes cuando operan. Dos brechas que prefiero que escuchen de mí primero: dependemos de un único proveedor activo de aceite, Lubrimar, más proveedores de envases con exposición de lead-time y calidad; y al inicio de esta gestión no había registros formales de QA, ni testigos de producto terminado, ni log de OSHA — un incidente menor de EPP. Estamos levantando la medición y el QA ahora, y ya aseguramos un proveedor alternativo de tambores para el segundo trimestre.</w:t>
       </w:r>
     </w:p>
     <w:p>
@@ -2134,7 +2134,7 @@
           <w:sz w:val="19"/>
           <w:szCs w:val="19"/>
         </w:rPr>
-        <w:t xml:space="preserve">Produced 134,620 gal (22 workdays) · Billed 103,453 gal · Inventory build ≈31K gal · Incidents 0.</w:t>
+        <w:t xml:space="preserve">Q1 production 374,866 gal (+28.2% YoY) · monthly avg 127,372 · peak Mar 141,506 · Quarts line 96.5% util (primary bottleneck) · run-rate ~1.50M gal/yr.</w:t>
       </w:r>
     </w:p>
     <w:p>

</xml_diff>